<commit_message>
Aviso liquidez: bloquear generacion sin nombre/WhatsApp + Instagram configurable
- FCN_Suite.html: el boton "Descargar archivo" queda deshabilitado si falta el nombre
  del asesor o su WhatsApp (antes solo avisaba). Campo Instagram nuevo en el modal:
  si el asesor lo deja vacio, el CSV usa el de Balanz (instagram.com/balanzcapital).
  Columna Instagram agregada al CSV.
- Aviso-liquidez.docx: el link "Instagram" del pie ahora sale del campo de combinacion
  (cada asesor su Instagram, o el de Balanz). Cripto pasa a decir solo "(muy volatil)".
- INSTRUCCIONES.md: aclarado que sale de la Suite vs de la plantilla.

Co-Authored-By: Claude Sonnet 5 <noreply@anthropic.com>
</commit_message>
<xml_diff>
--- a/plantillas-mail/Aviso-liquidez.docx
+++ b/plantillas-mail/Aviso-liquidez.docx
@@ -680,16 +680,6 @@
       </w:r>
     </w:p>
     <w:p>
-      <w:hyperlink r:id="rId21">
-        <w:r>
-          <w:rPr>
-            <w:sz w:val="16"/>
-            <w:color w:val="106CB5"/>
-            <w:u w:val="single"/>
-          </w:rPr>
-          <w:t xml:space="preserve">Comunidad de WhatsApp</w:t>
-        </w:r>
-      </w:hyperlink>
       <w:r>
         <w:rPr>
           <w:rFonts w:ascii="Calibri" w:hAnsi="Calibri"/>
@@ -698,18 +688,66 @@
           <w:color w:val="6C7572"/>
           <w:sz w:val="16"/>
         </w:rPr>
-        <w:t xml:space="preserve">     ·     </w:t>
+        <w:t xml:space="preserve">Seguime en </w:t>
       </w:r>
-      <w:hyperlink r:id="rId22">
+      <w:r>
+        <w:rPr>
+          <w:sz w:val="16"/>
+          <w:color w:val="106CB5"/>
+          <w:u w:val="single"/>
+        </w:rPr>
+        <w:fldChar w:fldCharType="begin"/>
+      </w:r>
+      <w:r>
+        <w:rPr>
+          <w:sz w:val="16"/>
+          <w:color w:val="106CB5"/>
+          <w:u w:val="single"/>
+        </w:rPr>
+        <w:instrText xml:space="preserve"> HYPERLINK "</w:instrText>
+      </w:r>
+      <w:fldSimple w:instr=" MERGEFIELD Instagram ">
         <w:r>
           <w:rPr>
             <w:sz w:val="16"/>
             <w:color w:val="106CB5"/>
             <w:u w:val="single"/>
           </w:rPr>
-          <w:t xml:space="preserve">Instagram</w:t>
+          <w:t>«Instagram»</w:t>
         </w:r>
-      </w:hyperlink>
+      </w:fldSimple>
+      <w:r>
+        <w:rPr>
+          <w:sz w:val="16"/>
+          <w:color w:val="106CB5"/>
+          <w:u w:val="single"/>
+        </w:rPr>
+        <w:instrText xml:space="preserve">" </w:instrText>
+      </w:r>
+      <w:r>
+        <w:rPr>
+          <w:sz w:val="16"/>
+          <w:color w:val="106CB5"/>
+          <w:u w:val="single"/>
+        </w:rPr>
+        <w:fldChar w:fldCharType="separate"/>
+      </w:r>
+      <w:r>
+        <w:rPr>
+          <w:sz w:val="16"/>
+          <w:color w:val="106CB5"/>
+          <w:u w:val="single"/>
+        </w:rPr>
+        <w:t xml:space="preserve">Instagram</w:t>
+      </w:r>
+      <w:r>
+        <w:rPr>
+          <w:sz w:val="16"/>
+          <w:color w:val="106CB5"/>
+          <w:u w:val="single"/>
+        </w:rPr>
+        <w:fldChar w:fldCharType="end"/>
+      </w:r>
     </w:p>
     <w:sectPr>
       <w:pgSz w:w="12240" w:h="15840"/>

</xml_diff>